<commit_message>
R2: title 'not always', Pareto claim audit, 46%/92% denominators, T1DM wording, Table 3 dominance defs
Co-Authored-By: Tatsuki Onishi <bougtoir@gmail.com>
</commit_message>
<xml_diff>
--- a/manuscript/cover_letter.docx
+++ b/manuscript/cover_letter.docx
@@ -9,9 +9,9 @@
     </w:p>
     <w:p>
       <w:r>
-        <w:t>We submit the manuscript "Maximum hormonal action is not optimal:</w:t>
+        <w:t>We submit the manuscript "Maximum hormonal action is not always optimal:</w:t>
         <w:br/>
-        <w:t>interior optima of endocrine feedback efficacy in a validated</w:t>
+        <w:t>interior optima of endocrine feedback efficacy in a previously validated</w:t>
         <w:br/>
         <w:t>glucose–insulin–glucagon model" for consideration in the Journal of</w:t>
         <w:br/>
@@ -20,19 +20,21 @@
     </w:p>
     <w:p>
       <w:r>
-        <w:t>Homeostatic feedback loops are presumed to work best at maximal</w:t>
+        <w:t>Using a previously validated whole-body glucose–insulin–glucagon model</w:t>
         <w:br/>
-        <w:t>responsiveness. Using a validated whole-body glucose–insulin–glucagon</w:t>
+        <w:t>(the Python port reproduced key upstream validation outputs), we show a</w:t>
         <w:br/>
-        <w:t>model, we show this is not true: several interventions have strict</w:t>
+        <w:t>subset of interventions exhibits strict interior optima — moderate</w:t>
         <w:br/>
-        <w:t>interior optima (moderate modulation beats both baseline and maximum),</w:t>
+        <w:t>modulation beats both baseline and maximum — arising from a Braess-like</w:t>
         <w:br/>
-        <w:t>arising from a Braess-like trade-off between opposing failure modes. The</w:t>
+        <w:t>tension between opposing failure modes. The optima are stable to grid</w:t>
         <w:br/>
-        <w:t>finding is robust to loss-weighting, grid and solver checks, persists in</w:t>
+        <w:t>and solver checks, show explicit dependence on loss-function</w:t>
         <w:br/>
-        <w:t>insulin-resistant and insulin-deficient states, and is corroborated in a</w:t>
+        <w:t>composition (reported with denominators), persist in insulin-resistant</w:t>
+        <w:br/>
+        <w:t>and insulin-deficient states, and receive exploratory corroboration in a</w:t>
         <w:br/>
         <w:t>minimal HPT-axis model.</w:t>
       </w:r>

</xml_diff>

<commit_message>
Final revision: figure renumbering (citation order), robustness grammar, rewritten cover letter, audits + revised zip
Co-Authored-By: Tatsuki Onishi <bougtoir@gmail.com>
</commit_message>
<xml_diff>
--- a/manuscript/cover_letter.docx
+++ b/manuscript/cover_letter.docx
@@ -9,47 +9,97 @@
     </w:p>
     <w:p>
       <w:r>
-        <w:t>We submit the manuscript "Maximum hormonal action is not always optimal:</w:t>
+        <w:t>Endocrinology is fundamentally concerned with homeostasis, yet hormonal</w:t>
         <w:br/>
-        <w:t>interior optima in a previously validated glucose–insulin–glucagon model"</w:t>
+        <w:t>efficacy is usually described locally — how strongly a signal acts —</w:t>
         <w:br/>
-        <w:t>for consideration in the Journal of Endocrinology.</w:t>
+        <w:t>rather than systemically, that is, how strongly it should act for the</w:t>
+        <w:br/>
+        <w:t>feedback system as a whole. In the enclosed manuscript, "Maximum</w:t>
+        <w:br/>
+        <w:t>hormonal action is not always optimal: interior optima in a previously</w:t>
+        <w:br/>
+        <w:t>validated glucose–insulin–glucagon model", we ask whether those two</w:t>
+        <w:br/>
+        <w:t>quantities are necessarily the same. We find that they are not always</w:t>
+        <w:br/>
+        <w:t>the same.</w:t>
       </w:r>
     </w:p>
     <w:p>
       <w:r>
-        <w:t>Using a previously validated whole-body glucose–insulin–glucagon model</w:t>
+        <w:t>Using a previously validated 26-state whole-body</w:t>
         <w:br/>
-        <w:t>(the Python port reproduced key upstream validation outputs), we show a</w:t>
+        <w:t>glucose–insulin–glucagon model, we swept ten interventions that</w:t>
         <w:br/>
-        <w:t>subset of interventions exhibits strict interior optima — moderate</w:t>
+        <w:t>continuously scale insulin and glucagon signalling or secretion</w:t>
         <w:br/>
-        <w:t>modulation beats both baseline and maximum — arising from a Braess-like</w:t>
+        <w:t>efficacy across five physiological challenges, and scored each response</w:t>
         <w:br/>
-        <w:t>tension between opposing failure modes. The optima are stable to grid</w:t>
+        <w:t>with a composite homeostatic loss complemented by a weight-independent</w:t>
         <w:br/>
-        <w:t>and solver checks, show explicit dependence on loss-function</w:t>
+        <w:t>Pareto analysis of the glycaemic axes. Four of fifty</w:t>
         <w:br/>
-        <w:t>composition (reported with denominators), persist in insulin-resistant</w:t>
+        <w:t>intervention–challenge combinations show strict interior optima:</w:t>
         <w:br/>
-        <w:t>and insulin-deficient states, and receive exploratory corroboration in a</w:t>
+        <w:t>partial modulation outperforms both the unperturbed baseline and</w:t>
         <w:br/>
-        <w:t>minimal HPT-axis model.</w:t>
+        <w:t>maximal modulation. The clearest case — partial suppression of insulin</w:t>
+        <w:br/>
+        <w:t>secretion under IVGTT — has an intuitive mechanism: limiting the</w:t>
+        <w:br/>
+        <w:t>insulin excursion prevents reactive hypoglycaemia while retaining</w:t>
+        <w:br/>
+        <w:t>enough action to clear the load. The phenomenon is not confined to one</w:t>
+        <w:br/>
+        <w:t>hormone, one direction of modulation or one challenge, and the optimal</w:t>
+        <w:br/>
+        <w:t>modulation shifts under insulin-resistant and insulin-deficient states.</w:t>
       </w:r>
     </w:p>
     <w:p>
       <w:r>
-        <w:t>The study is fully reproducible: the complete pipeline, frozen upstream</w:t>
+        <w:t>We believe the conceptual advance matters to this journal's readers:</w:t>
         <w:br/>
-        <w:t>model code, all results, and the figures regenerate with a single</w:t>
+        <w:t>the quantity pharmacology often maximises — local efficacy — is not</w:t>
         <w:br/>
-        <w:t>command. This work is Paper 2 of a methodological series; it is</w:t>
+        <w:t>necessarily the quantity physiology optimises — homeostasis. The</w:t>
         <w:br/>
-        <w:t>self-contained and has not been published or submitted elsewhere. The</w:t>
+        <w:t>interior optimum is the empirical result; the Braess-like regime we</w:t>
         <w:br/>
-        <w:t>author declares no competing interests. An AI assistant was used for</w:t>
+        <w:t>describe is our interpretation, offered as a testable framework for</w:t>
         <w:br/>
-        <w:t>implementation support, disclosed in the manuscript.</w:t>
+        <w:t>systems-level endocrine physiology. We deliberately make no</w:t>
+        <w:br/>
+        <w:t>clinical-dose inference, claim no universal Braess behaviour and no</w:t>
+        <w:br/>
+        <w:t>general superiority of partial modulation, and present our</w:t>
+        <w:br/>
+        <w:t>hypothalamic–pituitary–thyroid extension as exploratory,</w:t>
+        <w:br/>
+        <w:t>hypothesis-generating evidence only.</w:t>
+      </w:r>
+    </w:p>
+    <w:p>
+      <w:r>
+        <w:t>The study is fully reproducible: the complete analysis pipeline, the</w:t>
+        <w:br/>
+        <w:t>frozen upstream model implementation with a provenance ledger, and all</w:t>
+        <w:br/>
+        <w:t>results and figures regenerate with a single command. The manuscript</w:t>
+        <w:br/>
+        <w:t>has not been published or submitted elsewhere. The author declares no</w:t>
+        <w:br/>
+        <w:t>competing interests. An AI assistant was used for implementation and</w:t>
+        <w:br/>
+        <w:t>drafting support, as disclosed in the manuscript.</w:t>
+      </w:r>
+    </w:p>
+    <w:p>
+      <w:r>
+        <w:t>We hope you find the question — and the answer — worth the journal's</w:t>
+        <w:br/>
+        <w:t>attention.</w:t>
       </w:r>
     </w:p>
     <w:p>

</xml_diff>